<commit_message>
fix: align patent graph evidence metadata
Separate representative-document assignees from family ownership summaries, add document-level family continuity relations, and refresh the Durvalumab case artifacts from verified source fields.
</commit_message>
<xml_diff>
--- a/durvalumab-pdl1-nsclc/durvalumab-pdl1-nsclc-fto-report.docx
+++ b/durvalumab-pdl1-nsclc/durvalumab-pdl1-nsclc-fto-report.docx
@@ -2343,7 +2343,7 @@
                 <w:color w:val="1F2937"/>
                 <w:sz w:val="16"/>
               </w:rPr>
-              <w:t>DVL-FAM-007</w:t>
+              <w:t>DVL-FAM-001</w:t>
             </w:r>
           </w:p>
         </w:tc>
@@ -2365,7 +2365,7 @@
                 <w:color w:val="1F2937"/>
                 <w:sz w:val="16"/>
               </w:rPr>
-              <w:t>WO2024234348A1</w:t>
+              <w:t>US9493565B2</w:t>
             </w:r>
           </w:p>
         </w:tc>
@@ -2387,7 +2387,7 @@
                 <w:color w:val="1F2937"/>
                 <w:sz w:val="16"/>
               </w:rPr>
-              <w:t>Biomarker for immune checkpoint blockade therapy in NSCLC</w:t>
+              <w:t>Fc-optimized anti-PD-L1 antibody (durvalumab/MEDI4736) composition and sequence</w:t>
             </w:r>
           </w:p>
         </w:tc>
@@ -2431,7 +2431,7 @@
                 <w:color w:val="1F2937"/>
                 <w:sz w:val="16"/>
               </w:rPr>
-              <w:t>0.43</w:t>
+              <w:t>0.41</w:t>
             </w:r>
           </w:p>
         </w:tc>
@@ -2453,7 +2453,7 @@
                 <w:color w:val="1F2937"/>
                 <w:sz w:val="16"/>
               </w:rPr>
-              <w:t>F01</w:t>
+              <w:t>—</w:t>
             </w:r>
           </w:p>
         </w:tc>
@@ -2475,7 +2475,7 @@
                 <w:color w:val="1F2937"/>
                 <w:sz w:val="16"/>
               </w:rPr>
-              <w:t>WO record shown pending; not durvalumab-specific in the rapid screen</w:t>
+              <w:t>US public mirror shows active; CN and other national members require official-register review</w:t>
             </w:r>
           </w:p>
         </w:tc>
@@ -2499,7 +2499,7 @@
                 <w:color w:val="1F2937"/>
                 <w:sz w:val="16"/>
               </w:rPr>
-              <w:t>DVL-FAM-001</w:t>
+              <w:t>DVL-FAM-007</w:t>
             </w:r>
           </w:p>
         </w:tc>
@@ -2521,7 +2521,7 @@
                 <w:color w:val="1F2937"/>
                 <w:sz w:val="16"/>
               </w:rPr>
-              <w:t>US9493565B2</w:t>
+              <w:t>WO2024234348A1</w:t>
             </w:r>
           </w:p>
         </w:tc>
@@ -2543,7 +2543,7 @@
                 <w:color w:val="1F2937"/>
                 <w:sz w:val="16"/>
               </w:rPr>
-              <w:t>Fc-optimized anti-PD-L1 antibody (durvalumab/MEDI4736) composition and sequence</w:t>
+              <w:t>Biomarker for immune checkpoint blockade therapy in NSCLC</w:t>
             </w:r>
           </w:p>
         </w:tc>
@@ -2587,7 +2587,7 @@
                 <w:color w:val="1F2937"/>
                 <w:sz w:val="16"/>
               </w:rPr>
-              <w:t>0.41</w:t>
+              <w:t>0.40</w:t>
             </w:r>
           </w:p>
         </w:tc>
@@ -2609,7 +2609,7 @@
                 <w:color w:val="1F2937"/>
                 <w:sz w:val="16"/>
               </w:rPr>
-              <w:t>—</w:t>
+              <w:t>F01</w:t>
             </w:r>
           </w:p>
         </w:tc>
@@ -2631,7 +2631,7 @@
                 <w:color w:val="1F2937"/>
                 <w:sz w:val="16"/>
               </w:rPr>
-              <w:t>US public mirror shows active; CN and other national members require official-register review</w:t>
+              <w:t>WO record shown ceased; not durvalumab-specific in the rapid screen</w:t>
             </w:r>
           </w:p>
         </w:tc>
@@ -2943,7 +2943,7 @@
                 <w:color w:val="1F2937"/>
                 <w:sz w:val="16"/>
               </w:rPr>
-              <w:t>WO publication; CN/US national-phase status not established in this screening</w:t>
+              <w:t>WO PCT record shown ceased; AU/CN/EP/KR/IL national or regional members identified on public mirror; live status requires official-register confirmat…</w:t>
             </w:r>
           </w:p>
         </w:tc>
@@ -5182,7 +5182,7 @@
                 <w:color w:val="1F2937"/>
                 <w:sz w:val="17"/>
               </w:rPr>
-              <w:t>DVL-FAM-007</w:t>
+              <w:t>DVL-FAM-001</w:t>
             </w:r>
           </w:p>
         </w:tc>
@@ -5226,7 +5226,7 @@
                 <w:color w:val="1F2937"/>
                 <w:sz w:val="17"/>
               </w:rPr>
-              <w:t>boundary</w:t>
+              <w:t>core</w:t>
             </w:r>
           </w:p>
         </w:tc>
@@ -5248,7 +5248,7 @@
                 <w:color w:val="1F2937"/>
                 <w:sz w:val="17"/>
               </w:rPr>
-              <w:t>F01</w:t>
+              <w:t>—</w:t>
             </w:r>
           </w:p>
         </w:tc>
@@ -5270,7 +5270,7 @@
                 <w:color w:val="1F2937"/>
                 <w:sz w:val="17"/>
               </w:rPr>
-              <w:t>F02, F03, F04, F05</w:t>
+              <w:t>F01, F02, F03, F04, F05</w:t>
             </w:r>
           </w:p>
         </w:tc>
@@ -5292,7 +5292,7 @@
                 <w:color w:val="1F2937"/>
                 <w:sz w:val="17"/>
               </w:rPr>
-              <w:t>Google Patents public mirror; claim-level linkage to durvalumab not established</w:t>
+              <w:t>Google Patents public mirror; USPTO link available on record</w:t>
             </w:r>
           </w:p>
         </w:tc>
@@ -5316,7 +5316,7 @@
                 <w:color w:val="1F2937"/>
                 <w:sz w:val="17"/>
               </w:rPr>
-              <w:t>DVL-FAM-001</w:t>
+              <w:t>DVL-FAM-007</w:t>
             </w:r>
           </w:p>
         </w:tc>
@@ -5360,7 +5360,7 @@
                 <w:color w:val="1F2937"/>
                 <w:sz w:val="17"/>
               </w:rPr>
-              <w:t>core</w:t>
+              <w:t>boundary</w:t>
             </w:r>
           </w:p>
         </w:tc>
@@ -5382,7 +5382,7 @@
                 <w:color w:val="1F2937"/>
                 <w:sz w:val="17"/>
               </w:rPr>
-              <w:t>—</w:t>
+              <w:t>F01</w:t>
             </w:r>
           </w:p>
         </w:tc>
@@ -5404,7 +5404,7 @@
                 <w:color w:val="1F2937"/>
                 <w:sz w:val="17"/>
               </w:rPr>
-              <w:t>F01, F02, F03, F04, F05</w:t>
+              <w:t>F02, F03, F04, F05</w:t>
             </w:r>
           </w:p>
         </w:tc>
@@ -5426,7 +5426,7 @@
                 <w:color w:val="1F2937"/>
                 <w:sz w:val="17"/>
               </w:rPr>
-              <w:t>Google Patents public mirror; USPTO link available on record</w:t>
+              <w:t>Google Patents public mirror; claim-level linkage to durvalumab not established</w:t>
             </w:r>
           </w:p>
         </w:tc>
@@ -7245,7 +7245,7 @@
                 <w:color w:val="1F2937"/>
                 <w:sz w:val="17"/>
               </w:rPr>
-              <w:t>WO publication; CN/US national-phase status not established in this screening</w:t>
+              <w:t>WO PCT record shown ceased; AU/CN/EP/KR/IL national or regional members identified on public mirror; live status requires official-register confirmation</w:t>
             </w:r>
           </w:p>
         </w:tc>
@@ -8961,7 +8961,7 @@
                 <w:color w:val="1F2937"/>
                 <w:sz w:val="17"/>
               </w:rPr>
-              <w:t>LOW · 初筛分数 0.43</w:t>
+              <w:t>LOW · 初筛分数 0.4</w:t>
             </w:r>
           </w:p>
         </w:tc>
@@ -9145,7 +9145,7 @@
                 <w:color w:val="1F2937"/>
                 <w:sz w:val="17"/>
               </w:rPr>
-              <w:t>WO record shown pending; not durvalumab-specific in the rapid screen</w:t>
+              <w:t>WO record shown ceased; not durvalumab-specific in the rapid screen</w:t>
             </w:r>
           </w:p>
         </w:tc>
@@ -13800,7 +13800,7 @@
           <w:color w:val="667085"/>
           <w:sz w:val="17"/>
         </w:rPr>
-        <w:t>生成日期：2026-08-06 · 案例目录：durvalumab-pdl1-nsclc</w:t>
+        <w:t>生成日期：2026-08-07 · 案例目录：durvalumab-pdl1-nsclc</w:t>
       </w:r>
     </w:p>
     <w:sectPr>

</xml_diff>